<commit_message>
Lab 3 is complete.
</commit_message>
<xml_diff>
--- a/doc/Web-technoloyReport1.docx
+++ b/doc/Web-technoloyReport1.docx
@@ -2103,7 +2103,7 @@
                 <w:sz w:val="28"/>
                 <w:szCs w:val="28"/>
               </w:rPr>
-              <w:t>15</w:t>
+              <w:t>17</w:t>
             </w:r>
             <w:r>
               <w:rPr>
@@ -4593,7 +4593,12 @@
       <w:bookmarkStart w:id="9" w:name="_Toc227841197"/>
       <w:r>
         <w:lastRenderedPageBreak/>
-        <w:t>ЗАКЛЮЧЕНИЕ</w:t>
+        <w:t>ЗАК</w:t>
+      </w:r>
+      <w:bookmarkStart w:id="10" w:name="_GoBack"/>
+      <w:bookmarkEnd w:id="10"/>
+      <w:r>
+        <w:t>ЛЮЧЕНИЕ</w:t>
       </w:r>
       <w:bookmarkEnd w:id="9"/>
     </w:p>
@@ -4667,8 +4672,6 @@
         </w:rPr>
         <w:t>.</w:t>
       </w:r>
-      <w:bookmarkStart w:id="10" w:name="_GoBack"/>
-      <w:bookmarkEnd w:id="10"/>
     </w:p>
     <w:sectPr>
       <w:footerReference w:type="default" r:id="rId15"/>
@@ -10478,7 +10481,7 @@
 </file>
 
 <file path=customXml/itemProps1.xml><?xml version="1.0" encoding="utf-8"?>
-<ds:datastoreItem xmlns:ds="http://schemas.openxmlformats.org/officeDocument/2006/customXml" ds:itemID="{BC06F5A2-42F0-416C-9128-A2EED513F3B5}">
+<ds:datastoreItem xmlns:ds="http://schemas.openxmlformats.org/officeDocument/2006/customXml" ds:itemID="{4004C344-C36D-4627-9900-6B0CDFEBC480}">
   <ds:schemaRefs>
     <ds:schemaRef ds:uri="http://schemas.openxmlformats.org/officeDocument/2006/bibliography"/>
   </ds:schemaRefs>

</xml_diff>